<commit_message>
Reposition resume for Calgary CX/architecture roles
Broaden positioning from Node.js/Angular commercial banking to
Solution Architect | Customer Experience Platforms | Financial
Services, add relocation-to-Calgary signal, and surface Amazon
Connect (TransUnion, Contact Lens/Bedrock) and ServiceNow work
that wasn't previously represented on the resume or landing page.

Co-Authored-By: Claude Sonnet 5 <noreply@anthropic.com>
Claude-Session: https://claude.ai/code/session_018idxQ7ZTJyApxkhjV8ymmr
</commit_message>
<xml_diff>
--- a/resume.docx
+++ b/resume.docx
@@ -28,6 +28,12 @@
       </w:pPr>
       <w:r>
         <w:t xml:space="preserve">Toronto, ON</w:t>
+      </w:r>
+      <w:r>
+        <w:br/>
+      </w:r>
+      <w:r>
+        <w:t xml:space="preserve">Relocating to Calgary, AB</w:t>
       </w:r>
       <w:r>
         <w:br/>
@@ -152,7 +158,7 @@
         <w:pStyle w:val="FirstParagraph"/>
       </w:pPr>
       <w:r>
-        <w:t xml:space="preserve">Solution Architect and full-stack engineering leader with 5+ years delivering enterprise web applications in commercial banking.</w:t>
+        <w:t xml:space="preserve">Solution Architect and full-stack engineering leader with 5+ years delivering enterprise web applications and customer experience platforms in commercial banking.</w:t>
       </w:r>
       <w:r>
         <w:t xml:space="preserve"> </w:t>
@@ -164,7 +170,13 @@
         <w:t xml:space="preserve"> </w:t>
       </w:r>
       <w:r>
-        <w:t xml:space="preserve">Currently the Solution Architect for BMO’s Online Banking for Business (OLBB) platform — owning front-end architecture, Node.js API design, and engineering team growth across a suite of products serving millions of commercial banking customers.</w:t>
+        <w:t xml:space="preserve">Currently the Solution Architect for BMO’s Online Banking for Business (OLBB) platform — owning front-end architecture, Node.js API design, and engineering team growth, while also architecting AI-enabled contact centre integrations (Amazon Connect, AWS Bedrock) and ServiceNow-based customer service workflows across a suite of products serving millions of commercial banking customers.</w:t>
+      </w:r>
+      <w:r>
+        <w:t xml:space="preserve"> </w:t>
+      </w:r>
+      <w:r>
+        <w:t xml:space="preserve">Relocating to Calgary, AB.</w:t>
       </w:r>
     </w:p>
     <w:p>
@@ -417,6 +429,28 @@
         </w:numPr>
       </w:pPr>
       <w:r>
+        <w:t xml:space="preserve">Architected Amazon Connect contact-centre integrations for commercial banking customer support, including a TransUnion caller-verification service to detect call spoofing/fraud and a Contact Lens transcript-analysis pipeline powered by AWS Bedrock (GenAI) for automated call quality and insights</w:t>
+      </w:r>
+    </w:p>
+    <w:p>
+      <w:pPr>
+        <w:numPr>
+          <w:ilvl w:val="0"/>
+          <w:numId w:val="1002"/>
+        </w:numPr>
+      </w:pPr>
+      <w:r>
+        <w:t xml:space="preserve">As dev lead, integrated OLBB applications with ServiceNow customer service workflows, including delivery of a virtual-agent chatbot for commercial banking customer support</w:t>
+      </w:r>
+    </w:p>
+    <w:p>
+      <w:pPr>
+        <w:numPr>
+          <w:ilvl w:val="0"/>
+          <w:numId w:val="1002"/>
+        </w:numPr>
+      </w:pPr>
+      <w:r>
         <w:t xml:space="preserve">Recruit, mentor, and grow a team of full-stack engineers; established code-review practices, architectural standards, and a culture of continuous improvement</w:t>
       </w:r>
     </w:p>
@@ -871,6 +905,50 @@
       </w:pPr>
       <w:r>
         <w:t xml:space="preserve">Agile / Scrum</w:t>
+      </w:r>
+    </w:p>
+    <w:p>
+      <w:pPr>
+        <w:numPr>
+          <w:ilvl w:val="0"/>
+          <w:numId w:val="1006"/>
+        </w:numPr>
+      </w:pPr>
+      <w:r>
+        <w:t xml:space="preserve">Amazon Connect / Contact Lens</w:t>
+      </w:r>
+    </w:p>
+    <w:p>
+      <w:pPr>
+        <w:numPr>
+          <w:ilvl w:val="0"/>
+          <w:numId w:val="1006"/>
+        </w:numPr>
+      </w:pPr>
+      <w:r>
+        <w:t xml:space="preserve">ServiceNow Integrations</w:t>
+      </w:r>
+    </w:p>
+    <w:p>
+      <w:pPr>
+        <w:numPr>
+          <w:ilvl w:val="0"/>
+          <w:numId w:val="1006"/>
+        </w:numPr>
+      </w:pPr>
+      <w:r>
+        <w:t xml:space="preserve">AWS Bedrock / GenAI</w:t>
+      </w:r>
+    </w:p>
+    <w:p>
+      <w:pPr>
+        <w:numPr>
+          <w:ilvl w:val="0"/>
+          <w:numId w:val="1006"/>
+        </w:numPr>
+      </w:pPr>
+      <w:r>
+        <w:t xml:space="preserve">Contact Centre &amp; CX Architecture</w:t>
       </w:r>
     </w:p>
     <w:p>

</xml_diff>

<commit_message>
Remove Fast Invites from projects
Co-Authored-By: Claude Sonnet 5 <noreply@anthropic.com>
Claude-Session: https://claude.ai/code/session_018idxQ7ZTJyApxkhjV8ymmr
</commit_message>
<xml_diff>
--- a/resume.docx
+++ b/resume.docx
@@ -1205,7 +1205,7 @@
         </w:numPr>
       </w:pPr>
       <w:r>
-        <w:t xml:space="preserve">Fast and Simple Meeting Invitations - (</w:t>
+        <w:t xml:space="preserve">Video Summarizer - (</w:t>
       </w:r>
       <w:hyperlink r:id="rId50">
         <w:r>
@@ -1216,28 +1216,6 @@
         </w:r>
       </w:hyperlink>
       <w:r>
-        <w:t xml:space="preserve">) — Threshold voting application for meeting link coordination; lightweight full-stack SaaS</w:t>
-      </w:r>
-    </w:p>
-    <w:p>
-      <w:pPr>
-        <w:numPr>
-          <w:ilvl w:val="0"/>
-          <w:numId w:val="1008"/>
-        </w:numPr>
-      </w:pPr>
-      <w:r>
-        <w:t xml:space="preserve">Video Summarizer - (</w:t>
-      </w:r>
-      <w:hyperlink r:id="rId51">
-        <w:r>
-          <w:rPr>
-            <w:rStyle w:val="Hyperlink"/>
-          </w:rPr>
-          <w:t xml:space="preserve">Demo</w:t>
-        </w:r>
-      </w:hyperlink>
-      <w:r>
         <w:t xml:space="preserve">) - Alpine.js, TailwindCSS</w:t>
       </w:r>
       <w:r>
@@ -1251,7 +1229,7 @@
       <w:pPr>
         <w:pStyle w:val="Heading1"/>
       </w:pPr>
-      <w:bookmarkStart w:id="52" w:name="extra--curriculars"/>
+      <w:bookmarkStart w:id="51" w:name="extra--curriculars"/>
       <w:r>
         <w:t xml:space="preserve">EXTRA-</w:t>
       </w:r>
@@ -1261,7 +1239,7 @@
       <w:r>
         <w:t xml:space="preserve">CURRICULARS</w:t>
       </w:r>
-      <w:bookmarkEnd w:id="52"/>
+      <w:bookmarkEnd w:id="51"/>
     </w:p>
     <w:p>
       <w:pPr>
@@ -1276,7 +1254,7 @@
       <w:r>
         <w:t xml:space="preserve"> </w:t>
       </w:r>
-      <w:hyperlink r:id="rId53">
+      <w:hyperlink r:id="rId52">
         <w:r>
           <w:rPr>
             <w:rStyle w:val="Hyperlink"/>
@@ -1295,11 +1273,11 @@
       <w:pPr>
         <w:pStyle w:val="Heading1"/>
       </w:pPr>
-      <w:bookmarkStart w:id="54" w:name="publications"/>
+      <w:bookmarkStart w:id="53" w:name="publications"/>
       <w:r>
         <w:t xml:space="preserve">PUBLICATIONS</w:t>
       </w:r>
-      <w:bookmarkEnd w:id="54"/>
+      <w:bookmarkEnd w:id="53"/>
     </w:p>
     <w:p>
       <w:pPr>
@@ -1308,7 +1286,7 @@
           <w:numId w:val="1010"/>
         </w:numPr>
       </w:pPr>
-      <w:hyperlink r:id="rId55">
+      <w:hyperlink r:id="rId54">
         <w:r>
           <w:rPr>
             <w:rStyle w:val="Hyperlink"/>
@@ -1339,11 +1317,11 @@
       <w:pPr>
         <w:pStyle w:val="Heading1"/>
       </w:pPr>
-      <w:bookmarkStart w:id="56" w:name="awards"/>
+      <w:bookmarkStart w:id="55" w:name="awards"/>
       <w:r>
         <w:t xml:space="preserve">AWARDS</w:t>
       </w:r>
-      <w:bookmarkEnd w:id="56"/>
+      <w:bookmarkEnd w:id="55"/>
     </w:p>
     <w:p>
       <w:pPr>
@@ -1352,7 +1330,7 @@
           <w:numId w:val="1011"/>
         </w:numPr>
       </w:pPr>
-      <w:hyperlink r:id="rId57">
+      <w:hyperlink r:id="rId56">
         <w:r>
           <w:rPr>
             <w:rStyle w:val="Hyperlink"/>

</xml_diff>